<commit_message>
added language selection in MokoScriptsExample
</commit_message>
<xml_diff>
--- a/MokoExampleReport.docx
+++ b/MokoExampleReport.docx
@@ -11,8 +11,20 @@
           <w:lang w:val="en-US"/>
         </w:rPr>
       </w:pPr>
-      <w:bookmarkStart w:id="0" w:name="string1"/>
+      <w:bookmarkStart w:id="0" w:name="language"/>
       <w:bookmarkEnd w:id="0"/>
+    </w:p>
+    <w:p>
+      <w:pPr>
+        <w:rPr>
+          <w:rFonts w:ascii="Times New Roman" w:hAnsi="Times New Roman" w:cs="Times New Roman"/>
+          <w:sz w:val="28"/>
+          <w:szCs w:val="28"/>
+          <w:lang w:val="en-US"/>
+        </w:rPr>
+      </w:pPr>
+      <w:bookmarkStart w:id="1" w:name="string1"/>
+      <w:bookmarkEnd w:id="1"/>
     </w:p>
     <w:tbl>
       <w:tblPr>
@@ -40,8 +52,8 @@
                 <w:lang w:val="en-US"/>
               </w:rPr>
             </w:pPr>
-            <w:bookmarkStart w:id="1" w:name="table1"/>
-            <w:bookmarkEnd w:id="1"/>
+            <w:bookmarkStart w:id="2" w:name="table1"/>
+            <w:bookmarkEnd w:id="2"/>
           </w:p>
         </w:tc>
         <w:tc>
@@ -110,8 +122,8 @@
           <w:lang w:val="en-US"/>
         </w:rPr>
       </w:pPr>
-      <w:bookmarkStart w:id="2" w:name="string2"/>
-      <w:bookmarkEnd w:id="2"/>
+      <w:bookmarkStart w:id="3" w:name="string2"/>
+      <w:bookmarkEnd w:id="3"/>
     </w:p>
     <w:tbl>
       <w:tblPr>
@@ -139,8 +151,8 @@
                 <w:lang w:val="en-US"/>
               </w:rPr>
             </w:pPr>
-            <w:bookmarkStart w:id="3" w:name="table2"/>
-            <w:bookmarkEnd w:id="3"/>
+            <w:bookmarkStart w:id="4" w:name="table2"/>
+            <w:bookmarkEnd w:id="4"/>
           </w:p>
         </w:tc>
         <w:tc>

</xml_diff>